<commit_message>
Docs: hosting is DigitalOcean, Singapore; policy and one-page summary updated, Word files regenerated
Co-Authored-By: Claude Sonnet 5.5 <noreply@anthropic.com>
Claude-Session: https://claude.ai/code/session_01GvNCdmbjqJbdwgpjRN1wEQ
</commit_message>
<xml_diff>
--- a/docs/legal/print/Data-Protection-Summary-ONE-PAGE-Timekeeper-Work.docx
+++ b/docs/legal/print/Data-Protection-Summary-ONE-PAGE-Timekeeper-Work.docx
@@ -52,7 +52,7 @@
           <w:b w:val="0"/>
           <w:sz w:val="20"/>
         </w:rPr>
-        <w:t>Attendance only: arrival and departure events at the workplace with the phone position at that moment, plus employee name, code, department and job title. No movement trail, no use other than attendance. Employees consent in writing; they see everything recorded about them in the app. Hosting: [provider], region [___], i.e. outside Mongolia (to be confirmed by counsel).</w:t>
+        <w:t>Attendance only: arrival and departure events at the workplace with the phone position at that moment, plus employee name, code, department and job title. No movement trail, no use other than attendance. Employees consent in writing; they see everything recorded about them in the app. Hosting: DigitalOcean, Singapore region, i.e. outside Mongolia (to be confirmed by counsel).</w:t>
       </w:r>
     </w:p>
     <w:p>
@@ -908,7 +908,7 @@
           <w:b w:val="0"/>
           <w:sz w:val="20"/>
         </w:rPr>
-        <w:t>2. May the data be stored outside Mongolia (cloud, region [___]); what must the consent and the policy say?</w:t>
+        <w:t>2. May the data be stored outside Mongolia (DigitalOcean, Singapore); what must the consent and the policy say?</w:t>
       </w:r>
     </w:p>
     <w:p>

</xml_diff>

<commit_message>
Docs: one-page summary: firewall, alerts, backups and restore test are in place; daily provider backups on
Co-Authored-By: Claude Sonnet 5.5 <noreply@anthropic.com>
Claude-Session: https://claude.ai/code/session_01GvNCdmbjqJbdwgpjRN1wEQ
</commit_message>
<xml_diff>
--- a/docs/legal/print/Data-Protection-Summary-ONE-PAGE-Timekeeper-Work.docx
+++ b/docs/legal/print/Data-Protection-Summary-ONE-PAGE-Timekeeper-Work.docx
@@ -664,14 +664,14 @@
                 <w:b w:val="0"/>
                 <w:sz w:val="18"/>
               </w:rPr>
-              <w:t>Firewall, 5-minute health alerts to the operator, written incident plan.</w:t>
+              <w:t>Firewall on, 5-minute health alerts to the operator’s phone, written incident plan; the server was restarted and recovered by itself.</w:t>
             </w:r>
           </w:p>
         </w:tc>
         <w:tc>
           <w:tcPr>
             <w:tcW w:type="dxa" w:w="1984"/>
-            <w:shd w:val="clear" w:fill="FFF2CC"/>
+            <w:shd w:val="clear" w:fill="D9EAD3"/>
           </w:tcPr>
           <w:p>
             <w:pPr>
@@ -684,7 +684,7 @@
                 <w:b w:val="0"/>
                 <w:sz w:val="18"/>
               </w:rPr>
-              <w:t>Prepared, to be switched on</w:t>
+              <w:t>In place</w:t>
             </w:r>
           </w:p>
         </w:tc>
@@ -724,7 +724,7 @@
                 <w:b w:val="0"/>
                 <w:sz w:val="18"/>
               </w:rPr>
-              <w:t>Nightly encrypted backups (last 14 kept), restore procedure tested. Up to 24 h of data could be lost; point-in-time recovery to follow.</w:t>
+              <w:t>Nightly encrypted backups (last 14 kept), a daily whole-server copy at the hosting provider, and a restore tested on the server. Up to 24 h of data could be lost; point-in-time recovery to follow.</w:t>
             </w:r>
           </w:p>
         </w:tc>
@@ -744,7 +744,7 @@
                 <w:b w:val="0"/>
                 <w:sz w:val="18"/>
               </w:rPr>
-              <w:t>Prepared, to be switched on / Planned before production</w:t>
+              <w:t>In place / Planned before production</w:t>
             </w:r>
           </w:p>
         </w:tc>

</xml_diff>